<commit_message>
feat: indice automatico en el perfil fime y marcadores en el PDF
El perfil fime era el unico con portada que no traia campo TOC, asi que sus
entregables salian sin indice aunque el formato de la facultad si lo pide.
Se le agrega a portada-fime.docx el mismo bloque de topicos y formemp: salto
de pagina, titulo "Indice" con formato directo para que no se liste a si
mismo, y el campo TOC \o "1-3" \h \z \u. La marca \h es la que lo vuelve
navegable con clic. Aqui el salto va en su propio parrafo, no con
pageBreakBefore como en lbtssi: la portada estandar es corta y el indice cae
en la pagina 2 sin hoja en blanco de por medio.

Ademas, ExportAsFixedFormat pasa CreateBookmarks = 1, asi que los Titulo
1/2/3 salen tambien en el panel de marcadores del PDF. Aplica a todos los
perfiles.

Co-Authored-By: Claude Opus 5 (1M context) <noreply@anthropic.com>
</commit_message>
<xml_diff>
--- a/plantillas/portada-fime.docx
+++ b/plantillas/portada-fime.docx
@@ -530,6 +530,78 @@
           <w:rFonts w:eastAsia="Arial" w:cs="Arial"/>
         </w:rPr>
         <w:t>{{FECHA}}</w:t>
+      </w:r>
+    </w:p>
+    <w:p>
+      <w:pPr>
+        <w:rPr>
+          <w:rFonts w:eastAsia="Arial" w:cs="Arial"/>
+        </w:rPr>
+      </w:pPr>
+      <w:r>
+        <w:rPr>
+          <w:rFonts w:eastAsia="Arial" w:cs="Arial"/>
+        </w:rPr>
+        <w:br w:type="page"/>
+      </w:r>
+    </w:p>
+    <w:p>
+      <w:pPr>
+        <w:spacing w:before="480" w:after="240"/>
+        <w:rPr>
+          <w:rFonts w:eastAsia="Arial" w:cs="Arial"/>
+          <w:b/>
+          <w:sz w:val="28"/>
+        </w:rPr>
+      </w:pPr>
+      <w:r>
+        <w:rPr>
+          <w:rFonts w:eastAsia="Arial" w:cs="Arial"/>
+          <w:b/>
+          <w:sz w:val="28"/>
+        </w:rPr>
+        <w:t>Índice</w:t>
+      </w:r>
+    </w:p>
+    <w:p>
+      <w:pPr>
+        <w:spacing w:before="480" w:after="240"/>
+        <w:rPr>
+          <w:rFonts w:eastAsia="Arial" w:cs="Arial"/>
+        </w:rPr>
+      </w:pPr>
+      <w:r>
+        <w:rPr>
+          <w:rFonts w:eastAsia="Arial" w:cs="Arial"/>
+        </w:rPr>
+        <w:fldChar w:fldCharType="begin"/>
+      </w:r>
+      <w:r>
+        <w:rPr>
+          <w:rFonts w:eastAsia="Arial" w:cs="Arial"/>
+        </w:rPr>
+        <w:instrText xml:space="preserve"> TOC \o "1-3" \h \z \u </w:instrText>
+      </w:r>
+      <w:r>
+        <w:rPr>
+          <w:rFonts w:eastAsia="Arial" w:cs="Arial"/>
+        </w:rPr>
+        <w:fldChar w:fldCharType="separate"/>
+      </w:r>
+      <w:r>
+        <w:rPr>
+          <w:rFonts w:eastAsia="Arial" w:cs="Arial"/>
+          <w:b/>
+          <w:bCs/>
+          <w:noProof/>
+        </w:rPr>
+        <w:t>No se encontraron entradas de tabla de contenido.</w:t>
+      </w:r>
+      <w:r>
+        <w:rPr>
+          <w:rFonts w:eastAsia="Arial" w:cs="Arial"/>
+        </w:rPr>
+        <w:fldChar w:fldCharType="end"/>
       </w:r>
     </w:p>
     <w:sectPr>

</xml_diff>